<commit_message>
Actualizacion Vol 4: Reconstruidos manuscritos docx y 15 escenas 8k exactas por prompt de usuario
</commit_message>
<xml_diff>
--- a/libros/oni-no-ketsuryu-volumen-4/libro.docx
+++ b/libros/oni-no-ketsuryu-volumen-4/libro.docx
@@ -7,315 +7,10 @@
         <w:jc w:val="center"/>
       </w:pPr>
       <w:r>
-        <w:rPr>
-          <w:rFonts w:ascii="Arial" w:hAnsi="Arial"/>
-          <w:b/>
-          <w:color w:val="DC2626"/>
-          <w:sz w:val="52"/>
-        </w:rPr>
-        <w:t>ONI NO KETSURYŪ</w:t>
-        <w:br/>
-        <w:t>(鬼の血流 - La Estirpe de la Sangre)</w:t>
-        <w:br/>
-      </w:r>
-      <w:r>
-        <w:rPr>
-          <w:rFonts w:ascii="Arial" w:hAnsi="Arial"/>
-          <w:color w:val="B91C1C"/>
-          <w:sz w:val="32"/>
-        </w:rPr>
-        <w:t>Volumen 4: El Distrito de los Espejos y la Mariposa de la Sombra</w:t>
-        <w:br/>
-        <w:br/>
-        <w:t>MANGA / LIGHT NOVEL • FANTASÍA OSCURA &amp; ACCIÓN SENGOKU</w:t>
-        <w:br/>
-        <w:br/>
-      </w:r>
-      <w:r>
-        <w:rPr>
-          <w:rFonts w:ascii="Arial" w:hAnsi="Arial"/>
-          <w:b/>
-          <w:color w:val="475569"/>
-          <w:sz w:val="28"/>
-        </w:rPr>
-        <w:t>Por Nicolás Noguera</w:t>
-        <w:br/>
-        <w:br/>
-        <w:br/>
-      </w:r>
-    </w:p>
-    <w:p>
-      <w:pPr>
-        <w:jc w:val="center"/>
-      </w:pPr>
-    </w:p>
-    <w:p>
-      <w:r>
-        <w:drawing>
-          <wp:inline xmlns:a="http://schemas.openxmlformats.org/drawingml/2006/main" xmlns:pic="http://schemas.openxmlformats.org/drawingml/2006/picture">
-            <wp:extent cx="4114800" cy="2296633"/>
-            <wp:docPr id="1" name="Picture 1"/>
-            <wp:cNvGraphicFramePr>
-              <a:graphicFrameLocks noChangeAspect="1"/>
-            </wp:cNvGraphicFramePr>
-            <a:graphic>
-              <a:graphicData uri="http://schemas.openxmlformats.org/drawingml/2006/picture">
-                <pic:pic>
-                  <pic:nvPicPr>
-                    <pic:cNvPr id="0" name="portada.jpg"/>
-                    <pic:cNvPicPr/>
-                  </pic:nvPicPr>
-                  <pic:blipFill>
-                    <a:blip r:embed="rId9"/>
-                    <a:stretch>
-                      <a:fillRect/>
-                    </a:stretch>
-                  </pic:blipFill>
-                  <pic:spPr>
-                    <a:xfrm>
-                      <a:off x="0" y="0"/>
-                      <a:ext cx="4114800" cy="2296633"/>
-                    </a:xfrm>
-                    <a:prstGeom prst="rect"/>
-                  </pic:spPr>
-                </pic:pic>
-              </a:graphicData>
-            </a:graphic>
-          </wp:inline>
-        </w:drawing>
-      </w:r>
-    </w:p>
-    <w:p>
-      <w:r>
-        <w:br w:type="page"/>
-      </w:r>
-    </w:p>
-    <w:p>
-      <w:pPr>
-        <w:jc w:val="center"/>
-      </w:pPr>
-      <w:r>
-        <w:rPr>
-          <w:rFonts w:ascii="Arial" w:hAnsi="Arial"/>
-          <w:b/>
-          <w:color w:val="DC2626"/>
-          <w:sz w:val="40"/>
-        </w:rPr>
-        <w:t>TABLA DE CONTENIDOS</w:t>
-        <w:br/>
-      </w:r>
-    </w:p>
-    <w:p>
-      <w:r>
-        <w:rPr>
-          <w:b/>
-          <w:color w:val="B91C1C"/>
-        </w:rPr>
-        <w:t xml:space="preserve">• Capítulo 1: </w:t>
-      </w:r>
-      <w:r>
-        <w:rPr>
-          <w:i/>
-        </w:rPr>
-        <w:t>La Finca del Fuego</w:t>
-      </w:r>
-    </w:p>
-    <w:p>
-      <w:r>
-        <w:rPr>
-          <w:b/>
-          <w:color w:val="B91C1C"/>
-        </w:rPr>
-        <w:t xml:space="preserve">• Capítulo 2: </w:t>
-      </w:r>
-      <w:r>
-        <w:rPr>
-          <w:i/>
-        </w:rPr>
-        <w:t>La Ciudad que Nunca Duerme</w:t>
-      </w:r>
-    </w:p>
-    <w:p>
-      <w:r>
-        <w:rPr>
-          <w:b/>
-          <w:color w:val="B91C1C"/>
-        </w:rPr>
-        <w:t xml:space="preserve">• Capítulo 3: </w:t>
-      </w:r>
-      <w:r>
-        <w:rPr>
-          <w:i/>
-        </w:rPr>
-        <w:t>El Doble Lunar</w:t>
-      </w:r>
-    </w:p>
-    <w:p>
-      <w:r>
-        <w:rPr>
-          <w:b/>
-          <w:color w:val="B91C1C"/>
-        </w:rPr>
-        <w:t xml:space="preserve">• Capítulo 4: </w:t>
-      </w:r>
-      <w:r>
-        <w:rPr>
-          <w:i/>
-        </w:rPr>
-        <w:t>La Purificación de la Sangre</w:t>
-      </w:r>
-    </w:p>
-    <w:p>
-      <w:r>
-        <w:rPr>
-          <w:b/>
-          <w:color w:val="B91C1C"/>
-        </w:rPr>
-        <w:t xml:space="preserve">• Capítulo 5: </w:t>
-      </w:r>
-      <w:r>
-        <w:rPr>
-          <w:i/>
-        </w:rPr>
-        <w:t>Las Cenizas de la Misericordia (Clímax del Volumen 4)</w:t>
-      </w:r>
-    </w:p>
-    <w:p>
-      <w:r>
-        <w:br w:type="page"/>
-      </w:r>
-    </w:p>
-    <w:p>
-      <w:r>
-        <w:bookmarkStart w:id="1" w:name="chap1"/>
-      </w:r>
-      <w:r>
-        <w:rPr>
-          <w:rFonts w:ascii="Arial" w:hAnsi="Arial"/>
-          <w:b/>
-          <w:color w:val="B91C1C"/>
-          <w:sz w:val="28"/>
-        </w:rPr>
-        <w:t>Capítulo 1</w:t>
-        <w:br/>
-      </w:r>
-      <w:r>
-        <w:rPr>
-          <w:rFonts w:ascii="Arial" w:hAnsi="Arial"/>
-          <w:b/>
-          <w:color w:val="DC2626"/>
-          <w:sz w:val="40"/>
-        </w:rPr>
-        <w:t>La Finca del Fuego</w:t>
-      </w:r>
-      <w:r>
-        <w:bookmarkEnd w:id="1"/>
-      </w:r>
-    </w:p>
-    <w:p>
-      <w:r>
-        <w:rPr>
-          <w:rFonts w:ascii="Arial" w:hAnsi="Arial"/>
-          <w:b/>
-          <w:color w:val="475569"/>
-          <w:sz w:val="26"/>
-        </w:rPr>
-        <w:br/>
-        <w:t>◆ Escena 1: Las Memorias del Primer Cazador</w:t>
-        <w:br/>
-      </w:r>
-    </w:p>
-    <w:p>
-      <w:r>
-        <w:rPr>
-          <w:rFonts w:ascii="Georgia" w:hAnsi="Georgia"/>
-          <w:sz w:val="22"/>
-        </w:rPr>
-        <w:t>Ren llegó a la Finca del Fuego al atardecer. La residencia, antes llena de vida, permanecía en un silencio sepulcral. El padre de Kenshin, un antiguo Pilar retirado y consumido por la bebida, lo recibió en el patio central.</w:t>
-        <w:br/>
-        <w:br/>
-        <w:t>Al ver la guarda con forma de llama en la katana negra de Ren y la marca carmesí en su mejilla, el anciano dejó caer su copa de sake.</w:t>
-        <w:br/>
-        <w:br/>
-        <w:t>—Esa marca... —murmuró el anciano con voz temblorosa—. No es una simple cicatriz de venas demoníacas. Es la Marca del Sol, el sello de los primeros espadachines que casi destruyen al Rey Oni hace mil años.</w:t>
-        <w:br/>
-        <w:br/>
-        <w:t>El anciano lo guio hasta la biblioteca secreta de la finca y le entregó un volumen antiguo con páginas de papel arroz desgastado: Los Diarios del Sol.</w:t>
-      </w:r>
-    </w:p>
-    <w:p>
-      <w:r>
-        <w:rPr>
-          <w:rFonts w:ascii="Arial" w:hAnsi="Arial"/>
-          <w:b/>
-          <w:color w:val="475569"/>
-          <w:sz w:val="26"/>
-        </w:rPr>
-        <w:br/>
-        <w:t>◆ Escena 2: La Danza del Sol</w:t>
-        <w:br/>
-      </w:r>
-    </w:p>
-    <w:p>
-      <w:r>
-        <w:rPr>
-          <w:rFonts w:ascii="Georgia" w:hAnsi="Georgia"/>
-          <w:sz w:val="22"/>
-        </w:rPr>
-        <w:t>Ren pasó dos días sin comer ni dormir dentro de la biblioteca, estudiando los grabados del diario. Las ilustraciones no mostraban posturas de esgrima complejas, sino una secuencia de doce movimientos de danza ritual que los herreros antiguos realizaban desde el amanecer hasta el anochecer para pedir la bendición del fuego.</w:t>
-        <w:br/>
-        <w:br/>
-        <w:t>Al cerrar los ojos, Ren recordó a su propio padre ejecutando esa misma danza frente al horno de la herrería cada año nuevo.</w:t>
-        <w:br/>
-        <w:br/>
-        <w:t>—No era solo un ritual... —comprendió Ren, poniéndose de pie con la katana en la mano—. La Respiración del Fuego de Herrería que me enseñó mi padre era la versión disfrazada de la Danza del Sol.</w:t>
-        <w:br/>
-        <w:br/>
-        <w:t>Al ejecutar el primer movimiento dentro del dojo, una ola de calor puro envolvió la habitación, volviendo la hoja negra de su katana de un color dorado incandescente.</w:t>
-      </w:r>
-    </w:p>
-    <w:p>
-      <w:r>
-        <w:rPr>
-          <w:rFonts w:ascii="Arial" w:hAnsi="Arial"/>
-          <w:b/>
-          <w:color w:val="475569"/>
-          <w:sz w:val="26"/>
-        </w:rPr>
-        <w:br/>
-        <w:t>◆ Escena 3: La Petición de la Mariposa</w:t>
-        <w:br/>
-      </w:r>
-    </w:p>
-    <w:p>
-      <w:r>
-        <w:rPr>
-          <w:rFonts w:ascii="Georgia" w:hAnsi="Georgia"/>
-          <w:sz w:val="22"/>
-        </w:rPr>
-        <w:t>Al salir de la finca, una mariposa de luz morada revoloteó sobre la cabeza de Ren. Detrás de él reapareció la chica silenciosa de la Selección Final —la joven de la máscara de zorro, cuyo nombre era Kanae, la nueva discípula del Pilar del Ingesta y Veneno.</w:t>
-        <w:br/>
-        <w:br/>
-        <w:t>—El Gremio requiere tu presencia en el Distrito de las Luces —dijo Kanae con voz suave pero firme—. Un demonio de nivel Quinto Lunar Rojo ha convertido el distrito de entretenimientos en su terreno de cacería. Los cazadores enviados anteriormente han desaparecido sin dejar rastro.</w:t>
-        <w:br/>
-        <w:br/>
-        <w:t>Ren miró la caja de madera en su espalda, donde Miyuki descansaba.</w:t>
-        <w:br/>
-        <w:br/>
-        <w:t>—Nos ponemos en marcha —respondió Ren—. Esta vez no dejaremos que ningún inocente caiga.</w:t>
-      </w:r>
-    </w:p>
-    <w:p>
-      <w:pPr>
-        <w:jc w:val="center"/>
-      </w:pPr>
-    </w:p>
-    <w:p>
-      <w:r>
         <w:drawing>
           <wp:inline xmlns:a="http://schemas.openxmlformats.org/drawingml/2006/main" xmlns:pic="http://schemas.openxmlformats.org/drawingml/2006/picture">
             <wp:extent cx="4572000" cy="2551814"/>
-            <wp:docPr id="2" name="Picture 2"/>
+            <wp:docPr id="1" name="Picture 1"/>
             <wp:cNvGraphicFramePr>
               <a:graphicFrameLocks noChangeAspect="1"/>
             </wp:cNvGraphicFramePr>
@@ -352,49 +47,449 @@
       </w:r>
     </w:p>
     <w:p>
-      <w:r>
-        <w:bookmarkStart w:id="2" w:name="chap2"/>
-      </w:r>
+      <w:bookmarkStart w:id="0" w:name="titulo_principal"/>
+      <w:pPr>
+        <w:keepNext/>
+        <w:spacing w:before="240" w:after="120"/>
+        <w:jc w:val="center"/>
+      </w:pPr>
       <w:r>
         <w:rPr>
-          <w:rFonts w:ascii="Arial" w:hAnsi="Arial"/>
+          <w:rFonts w:ascii="Calibri" w:hAnsi="Calibri"/>
           <w:b/>
-          <w:color w:val="B91C1C"/>
-          <w:sz w:val="28"/>
+          <w:color w:val="8B0000"/>
+          <w:sz w:val="40"/>
         </w:rPr>
-        <w:t>Capítulo 2</w:t>
-        <w:br/>
+        <w:t>Oni no Ketsuryū (鬼の血流 - La Estirpe de la Sangre)</w:t>
       </w:r>
+      <w:bookmarkEnd w:id="0"/>
+    </w:p>
+    <w:p>
+      <w:bookmarkStart w:id="1" w:name="subtitulo_vol4"/>
+      <w:pPr>
+        <w:keepNext/>
+        <w:spacing w:before="240" w:after="120"/>
+        <w:jc w:val="left"/>
+      </w:pPr>
       <w:r>
         <w:rPr>
-          <w:rFonts w:ascii="Arial" w:hAnsi="Arial"/>
+          <w:rFonts w:ascii="Calibri" w:hAnsi="Calibri"/>
           <w:b/>
-          <w:color w:val="DC2626"/>
-          <w:sz w:val="40"/>
+          <w:color w:val="4A5568"/>
+          <w:sz w:val="30"/>
         </w:rPr>
-        <w:t>La Ciudad que Nunca Duerme</w:t>
+        <w:t>Volumen 4: El Distrito de los Espejos y la Mariposa de la Sombra</w:t>
       </w:r>
+      <w:bookmarkEnd w:id="1"/>
+    </w:p>
+    <w:p>
+      <w:pPr>
+        <w:jc w:val="center"/>
+      </w:pPr>
       <w:r>
-        <w:bookmarkEnd w:id="2"/>
+        <w:rPr>
+          <w:i/>
+          <w:sz w:val="22"/>
+        </w:rPr>
+        <w:t>Autor: Nicolás Noguera | Formato: Manga / Light Novel Oficial</w:t>
+      </w:r>
+    </w:p>
+    <w:p>
+      <w:pPr>
+        <w:spacing w:after="360"/>
+      </w:pPr>
+    </w:p>
+    <w:p>
+      <w:bookmarkStart w:id="2" w:name="toc_header"/>
+      <w:pPr>
+        <w:keepNext/>
+        <w:spacing w:before="240" w:after="120"/>
+        <w:jc w:val="left"/>
+      </w:pPr>
+      <w:r>
+        <w:rPr>
+          <w:rFonts w:ascii="Calibri" w:hAnsi="Calibri"/>
+          <w:b/>
+          <w:color w:val="4A5568"/>
+          <w:sz w:val="30"/>
+        </w:rPr>
+        <w:t>ÍNDICE DE CONTENIDOS</w:t>
+      </w:r>
+      <w:bookmarkEnd w:id="2"/>
+    </w:p>
+    <w:p>
+      <w:pPr>
+        <w:spacing w:after="80"/>
+        <w:ind w:left="720"/>
+      </w:pPr>
+      <w:r>
+        <w:rPr>
+          <w:color w:val="2B6CB0"/>
+          <w:sz w:val="22"/>
+        </w:rPr>
+        <w:t>•  Capítulo 1: La Finca del Fuego</w:t>
+      </w:r>
+    </w:p>
+    <w:p>
+      <w:pPr>
+        <w:spacing w:after="80"/>
+        <w:ind w:left="720"/>
+      </w:pPr>
+      <w:r>
+        <w:rPr>
+          <w:color w:val="2B6CB0"/>
+          <w:sz w:val="22"/>
+        </w:rPr>
+        <w:t>•  Capítulo 2: La Ciudad que Nunca Duerme</w:t>
+      </w:r>
+    </w:p>
+    <w:p>
+      <w:pPr>
+        <w:spacing w:after="80"/>
+        <w:ind w:left="720"/>
+      </w:pPr>
+      <w:r>
+        <w:rPr>
+          <w:color w:val="2B6CB0"/>
+          <w:sz w:val="22"/>
+        </w:rPr>
+        <w:t>•  Capítulo 3: El Doble Lunar</w:t>
+      </w:r>
+    </w:p>
+    <w:p>
+      <w:pPr>
+        <w:spacing w:after="80"/>
+        <w:ind w:left="720"/>
+      </w:pPr>
+      <w:r>
+        <w:rPr>
+          <w:color w:val="2B6CB0"/>
+          <w:sz w:val="22"/>
+        </w:rPr>
+        <w:t>•  Capítulo 4: La Purificación de la Sangre</w:t>
+      </w:r>
+    </w:p>
+    <w:p>
+      <w:pPr>
+        <w:spacing w:after="80"/>
+        <w:ind w:left="720"/>
+      </w:pPr>
+      <w:r>
+        <w:rPr>
+          <w:color w:val="2B6CB0"/>
+          <w:sz w:val="22"/>
+        </w:rPr>
+        <w:t>•  Capítulo 5: Las Cenizas de la Misericordia (Clímax del Volumen 4)</w:t>
       </w:r>
     </w:p>
     <w:p>
       <w:r>
+        <w:br w:type="page"/>
+      </w:r>
+    </w:p>
+    <w:p>
+      <w:bookmarkStart w:id="10" w:name="cap_1"/>
+      <w:pPr>
+        <w:keepNext/>
+        <w:spacing w:before="240" w:after="120"/>
+        <w:jc w:val="center"/>
+      </w:pPr>
+      <w:r>
         <w:rPr>
-          <w:rFonts w:ascii="Arial" w:hAnsi="Arial"/>
+          <w:rFonts w:ascii="Calibri" w:hAnsi="Calibri"/>
           <w:b/>
-          <w:color w:val="475569"/>
-          <w:sz w:val="26"/>
+          <w:color w:val="8B0000"/>
+          <w:sz w:val="40"/>
         </w:rPr>
+        <w:t>Capítulo 1: La Finca del Fuego</w:t>
+      </w:r>
+      <w:bookmarkEnd w:id="10"/>
+    </w:p>
+    <w:p>
+      <w:bookmarkStart w:id="11" w:name="cap_1_esc"/>
+      <w:pPr>
+        <w:keepNext/>
+        <w:spacing w:before="240" w:after="120"/>
+        <w:jc w:val="left"/>
+      </w:pPr>
+      <w:r>
+        <w:rPr>
+          <w:rFonts w:ascii="Calibri" w:hAnsi="Calibri"/>
+          <w:b/>
+          <w:color w:val="4A5568"/>
+          <w:sz w:val="30"/>
+        </w:rPr>
+        <w:t>Escena 1: Las Memorias del Primer Cazador</w:t>
+      </w:r>
+      <w:bookmarkEnd w:id="11"/>
+    </w:p>
+    <w:p>
+      <w:pPr>
+        <w:spacing w:line="276" w:lineRule="auto" w:after="160"/>
+      </w:pPr>
+      <w:r>
+        <w:rPr>
+          <w:rFonts w:ascii="Calibri" w:hAnsi="Calibri"/>
+          <w:sz w:val="22"/>
+        </w:rPr>
+        <w:t>Ren llegó a la Finca del Fuego al atardecer. La residencia, antes llena de vida, permanecía en un silencio sepulcral. El padre de Kenshin, un antiguo Pilar retirado y consumido por la bebida, lo recibió en el patio central.</w:t>
         <w:br/>
-        <w:t>◆ Escena 1: El Lujo de las Sombras</w:t>
         <w:br/>
+        <w:t>Al ver la guarda con forma de llama en la katana negra de Ren y la marca carmesí en su mejilla, el anciano dejó caer su copa de sake.</w:t>
+        <w:br/>
+        <w:br/>
+        <w:t>—Esa marca... —murmuró el anciano con voz temblorosa—. No es una simple cicatriz de venas demoníacas. Es la Marca del Sol, el sello de los primeros espadachines que casi destruyen al Rey Oni hace mil años.</w:t>
+        <w:br/>
+        <w:br/>
+        <w:t>El anciano lo guio hasta la biblioteca secreta de la finca y le entregó un volumen antiguo con páginas de papel arroz desgastado: Los Diarios del Sol.</w:t>
+      </w:r>
+    </w:p>
+    <w:p>
+      <w:pPr>
+        <w:spacing w:before="120" w:after="280"/>
+        <w:jc w:val="center"/>
+      </w:pPr>
+      <w:r>
+        <w:drawing>
+          <wp:inline xmlns:a="http://schemas.openxmlformats.org/drawingml/2006/main" xmlns:pic="http://schemas.openxmlformats.org/drawingml/2006/picture">
+            <wp:extent cx="4754880" cy="2674620"/>
+            <wp:docPr id="2" name="Picture 2"/>
+            <wp:cNvGraphicFramePr>
+              <a:graphicFrameLocks noChangeAspect="1"/>
+            </wp:cNvGraphicFramePr>
+            <a:graphic>
+              <a:graphicData uri="http://schemas.openxmlformats.org/drawingml/2006/picture">
+                <pic:pic>
+                  <pic:nvPicPr>
+                    <pic:cNvPr id="0" name="escena_c1_e1.jpg"/>
+                    <pic:cNvPicPr/>
+                  </pic:nvPicPr>
+                  <pic:blipFill>
+                    <a:blip r:embed="rId10"/>
+                    <a:stretch>
+                      <a:fillRect/>
+                    </a:stretch>
+                  </pic:blipFill>
+                  <pic:spPr>
+                    <a:xfrm>
+                      <a:off x="0" y="0"/>
+                      <a:ext cx="4754880" cy="2674620"/>
+                    </a:xfrm>
+                    <a:prstGeom prst="rect"/>
+                  </pic:spPr>
+                </pic:pic>
+              </a:graphicData>
+            </a:graphic>
+          </wp:inline>
+        </w:drawing>
+      </w:r>
+    </w:p>
+    <w:p>
+      <w:bookmarkStart w:id="11" w:name="cap_1_esc"/>
+      <w:pPr>
+        <w:keepNext/>
+        <w:spacing w:before="240" w:after="120"/>
+        <w:jc w:val="left"/>
+      </w:pPr>
+      <w:r>
+        <w:rPr>
+          <w:rFonts w:ascii="Calibri" w:hAnsi="Calibri"/>
+          <w:b/>
+          <w:color w:val="4A5568"/>
+          <w:sz w:val="30"/>
+        </w:rPr>
+        <w:t>Escena 2: La Danza del Sol</w:t>
+      </w:r>
+      <w:bookmarkEnd w:id="11"/>
+    </w:p>
+    <w:p>
+      <w:pPr>
+        <w:spacing w:line="276" w:lineRule="auto" w:after="160"/>
+      </w:pPr>
+      <w:r>
+        <w:rPr>
+          <w:rFonts w:ascii="Calibri" w:hAnsi="Calibri"/>
+          <w:sz w:val="22"/>
+        </w:rPr>
+        <w:t>Ren pasó dos días sin comer ni dormir dentro de la biblioteca, estudiando los grabados del diario. Las ilustraciones no mostraban posturas de esgrima complejas, sino una secuencia de doce movimientos de danza ritual que los herreros antiguos realizaban desde el amanecer hasta el anochecer para pedir la bendición del fuego.</w:t>
+        <w:br/>
+        <w:br/>
+        <w:t>Al cerrar los ojos, Ren recordó a su propio padre ejecutando esa misma danza frente al horno de la herrería cada año nuevo.</w:t>
+        <w:br/>
+        <w:br/>
+        <w:t>—No era solo un ritual... —comprendió Ren, poniéndose de pie con la katana en la mano—. La Respiración del Fuego de Herrería que me enseñó mi padre era la versión disfrazada de la Danza del Sol.</w:t>
+        <w:br/>
+        <w:br/>
+        <w:t>Al ejecutar el primer movimiento dentro del dojo, una ola de calor puro envolvió la habitación, volviendo la hoja negra de su katana de un color dorado incandescente.</w:t>
+      </w:r>
+    </w:p>
+    <w:p>
+      <w:pPr>
+        <w:spacing w:before="120" w:after="280"/>
+        <w:jc w:val="center"/>
+      </w:pPr>
+      <w:r>
+        <w:drawing>
+          <wp:inline xmlns:a="http://schemas.openxmlformats.org/drawingml/2006/main" xmlns:pic="http://schemas.openxmlformats.org/drawingml/2006/picture">
+            <wp:extent cx="4754880" cy="2674620"/>
+            <wp:docPr id="3" name="Picture 3"/>
+            <wp:cNvGraphicFramePr>
+              <a:graphicFrameLocks noChangeAspect="1"/>
+            </wp:cNvGraphicFramePr>
+            <a:graphic>
+              <a:graphicData uri="http://schemas.openxmlformats.org/drawingml/2006/picture">
+                <pic:pic>
+                  <pic:nvPicPr>
+                    <pic:cNvPr id="0" name="escena_c1_e2.jpg"/>
+                    <pic:cNvPicPr/>
+                  </pic:nvPicPr>
+                  <pic:blipFill>
+                    <a:blip r:embed="rId11"/>
+                    <a:stretch>
+                      <a:fillRect/>
+                    </a:stretch>
+                  </pic:blipFill>
+                  <pic:spPr>
+                    <a:xfrm>
+                      <a:off x="0" y="0"/>
+                      <a:ext cx="4754880" cy="2674620"/>
+                    </a:xfrm>
+                    <a:prstGeom prst="rect"/>
+                  </pic:spPr>
+                </pic:pic>
+              </a:graphicData>
+            </a:graphic>
+          </wp:inline>
+        </w:drawing>
+      </w:r>
+    </w:p>
+    <w:p>
+      <w:bookmarkStart w:id="11" w:name="cap_1_esc"/>
+      <w:pPr>
+        <w:keepNext/>
+        <w:spacing w:before="240" w:after="120"/>
+        <w:jc w:val="left"/>
+      </w:pPr>
+      <w:r>
+        <w:rPr>
+          <w:rFonts w:ascii="Calibri" w:hAnsi="Calibri"/>
+          <w:b/>
+          <w:color w:val="4A5568"/>
+          <w:sz w:val="30"/>
+        </w:rPr>
+        <w:t>Escena 3: La Petición de la Mariposa</w:t>
+      </w:r>
+      <w:bookmarkEnd w:id="11"/>
+    </w:p>
+    <w:p>
+      <w:pPr>
+        <w:spacing w:line="276" w:lineRule="auto" w:after="160"/>
+      </w:pPr>
+      <w:r>
+        <w:rPr>
+          <w:rFonts w:ascii="Calibri" w:hAnsi="Calibri"/>
+          <w:sz w:val="22"/>
+        </w:rPr>
+        <w:t>Al salir de la finca, una mariposa de luz morada revoloteó sobre la cabeza de Ren. Detrás de él reapareció la chica silenciosa de la Selección Final —la joven de la máscara de zorro, cuyo nombre era Kanae, la nueva discípula del Pilar del Ingesta y Veneno.</w:t>
+        <w:br/>
+        <w:br/>
+        <w:t>—El Gremio requiere tu presencia en el Distrito de las Luces —dijo Kanae con voz suave pero firme—. Un demonio de nivel Quinto Lunar Rojo ha convertido el distrito de entretenimientos en su terreno de cacería. Los cazadores enviados anteriormente han desaparecido sin dejar rastro.</w:t>
+        <w:br/>
+        <w:br/>
+        <w:t>Ren miró la caja de madera en su espalda, donde Miyuki descansaba.</w:t>
+        <w:br/>
+        <w:br/>
+        <w:t>—Nos ponemos en marcha —respondió Ren—. Esta vez no dejaremos que ningún inocente caiga.</w:t>
+      </w:r>
+    </w:p>
+    <w:p>
+      <w:pPr>
+        <w:spacing w:before="120" w:after="280"/>
+        <w:jc w:val="center"/>
+      </w:pPr>
+      <w:r>
+        <w:drawing>
+          <wp:inline xmlns:a="http://schemas.openxmlformats.org/drawingml/2006/main" xmlns:pic="http://schemas.openxmlformats.org/drawingml/2006/picture">
+            <wp:extent cx="4754880" cy="2674620"/>
+            <wp:docPr id="4" name="Picture 4"/>
+            <wp:cNvGraphicFramePr>
+              <a:graphicFrameLocks noChangeAspect="1"/>
+            </wp:cNvGraphicFramePr>
+            <a:graphic>
+              <a:graphicData uri="http://schemas.openxmlformats.org/drawingml/2006/picture">
+                <pic:pic>
+                  <pic:nvPicPr>
+                    <pic:cNvPr id="0" name="escena_c1_e3.jpg"/>
+                    <pic:cNvPicPr/>
+                  </pic:nvPicPr>
+                  <pic:blipFill>
+                    <a:blip r:embed="rId12"/>
+                    <a:stretch>
+                      <a:fillRect/>
+                    </a:stretch>
+                  </pic:blipFill>
+                  <pic:spPr>
+                    <a:xfrm>
+                      <a:off x="0" y="0"/>
+                      <a:ext cx="4754880" cy="2674620"/>
+                    </a:xfrm>
+                    <a:prstGeom prst="rect"/>
+                  </pic:spPr>
+                </pic:pic>
+              </a:graphicData>
+            </a:graphic>
+          </wp:inline>
+        </w:drawing>
       </w:r>
     </w:p>
     <w:p>
       <w:r>
+        <w:br w:type="page"/>
+      </w:r>
+    </w:p>
+    <w:p>
+      <w:bookmarkStart w:id="20" w:name="cap_2"/>
+      <w:pPr>
+        <w:keepNext/>
+        <w:spacing w:before="240" w:after="120"/>
+        <w:jc w:val="center"/>
+      </w:pPr>
+      <w:r>
         <w:rPr>
-          <w:rFonts w:ascii="Georgia" w:hAnsi="Georgia"/>
+          <w:rFonts w:ascii="Calibri" w:hAnsi="Calibri"/>
+          <w:b/>
+          <w:color w:val="8B0000"/>
+          <w:sz w:val="40"/>
+        </w:rPr>
+        <w:t>Capítulo 2: La Ciudad que Nunca Duerme</w:t>
+      </w:r>
+      <w:bookmarkEnd w:id="20"/>
+    </w:p>
+    <w:p>
+      <w:bookmarkStart w:id="21" w:name="cap_2_esc"/>
+      <w:pPr>
+        <w:keepNext/>
+        <w:spacing w:before="240" w:after="120"/>
+        <w:jc w:val="left"/>
+      </w:pPr>
+      <w:r>
+        <w:rPr>
+          <w:rFonts w:ascii="Calibri" w:hAnsi="Calibri"/>
+          <w:b/>
+          <w:color w:val="4A5568"/>
+          <w:sz w:val="30"/>
+        </w:rPr>
+        <w:t>Escena 1: El Lujo de las Sombras</w:t>
+      </w:r>
+      <w:bookmarkEnd w:id="21"/>
+    </w:p>
+    <w:p>
+      <w:pPr>
+        <w:spacing w:line="276" w:lineRule="auto" w:after="160"/>
+      </w:pPr>
+      <w:r>
+        <w:rPr>
+          <w:rFonts w:ascii="Calibri" w:hAnsi="Calibri"/>
           <w:sz w:val="22"/>
         </w:rPr>
         <w:t>El Distrito de las Luces era una metrópolis nocturna deslumbrante. Gigantescas linternas de seda roja, casas de te con cortinas de bambú y puentes de madera sobre canales de agua iluminaban la noche. Cientos de personas caminaban festejando con música de samisen.</w:t>
@@ -410,22 +505,70 @@
       </w:r>
     </w:p>
     <w:p>
+      <w:pPr>
+        <w:spacing w:before="120" w:after="280"/>
+        <w:jc w:val="center"/>
+      </w:pPr>
       <w:r>
-        <w:rPr>
-          <w:rFonts w:ascii="Arial" w:hAnsi="Arial"/>
-          <w:b/>
-          <w:color w:val="475569"/>
-          <w:sz w:val="26"/>
-        </w:rPr>
-        <w:br/>
-        <w:t>◆ Escena 2: La Matrona del Espejo</w:t>
-        <w:br/>
+        <w:drawing>
+          <wp:inline xmlns:a="http://schemas.openxmlformats.org/drawingml/2006/main" xmlns:pic="http://schemas.openxmlformats.org/drawingml/2006/picture">
+            <wp:extent cx="4754880" cy="2674620"/>
+            <wp:docPr id="5" name="Picture 5"/>
+            <wp:cNvGraphicFramePr>
+              <a:graphicFrameLocks noChangeAspect="1"/>
+            </wp:cNvGraphicFramePr>
+            <a:graphic>
+              <a:graphicData uri="http://schemas.openxmlformats.org/drawingml/2006/picture">
+                <pic:pic>
+                  <pic:nvPicPr>
+                    <pic:cNvPr id="0" name="escena_c2_e1.jpg"/>
+                    <pic:cNvPicPr/>
+                  </pic:nvPicPr>
+                  <pic:blipFill>
+                    <a:blip r:embed="rId13"/>
+                    <a:stretch>
+                      <a:fillRect/>
+                    </a:stretch>
+                  </pic:blipFill>
+                  <pic:spPr>
+                    <a:xfrm>
+                      <a:off x="0" y="0"/>
+                      <a:ext cx="4754880" cy="2674620"/>
+                    </a:xfrm>
+                    <a:prstGeom prst="rect"/>
+                  </pic:spPr>
+                </pic:pic>
+              </a:graphicData>
+            </a:graphic>
+          </wp:inline>
+        </w:drawing>
       </w:r>
     </w:p>
     <w:p>
+      <w:bookmarkStart w:id="21" w:name="cap_2_esc"/>
+      <w:pPr>
+        <w:keepNext/>
+        <w:spacing w:before="240" w:after="120"/>
+        <w:jc w:val="left"/>
+      </w:pPr>
       <w:r>
         <w:rPr>
-          <w:rFonts w:ascii="Georgia" w:hAnsi="Georgia"/>
+          <w:rFonts w:ascii="Calibri" w:hAnsi="Calibri"/>
+          <w:b/>
+          <w:color w:val="4A5568"/>
+          <w:sz w:val="30"/>
+        </w:rPr>
+        <w:t>Escena 2: La Matrona del Espejo</w:t>
+      </w:r>
+      <w:bookmarkEnd w:id="21"/>
+    </w:p>
+    <w:p>
+      <w:pPr>
+        <w:spacing w:line="276" w:lineRule="auto" w:after="160"/>
+      </w:pPr>
+      <w:r>
+        <w:rPr>
+          <w:rFonts w:ascii="Calibri" w:hAnsi="Calibri"/>
           <w:sz w:val="22"/>
         </w:rPr>
         <w:t>Dentro de la casa Yoshiwara, la matrona principal —una mujer de belleza deslumbrante llamada Daki— descansaba sobre un diván de seda. Llevaba una faja obi de seda de diez metros de largo decorada con patrones de flores de cerezo.</w:t>
@@ -441,22 +584,70 @@
       </w:r>
     </w:p>
     <w:p>
+      <w:pPr>
+        <w:spacing w:before="120" w:after="280"/>
+        <w:jc w:val="center"/>
+      </w:pPr>
       <w:r>
-        <w:rPr>
-          <w:rFonts w:ascii="Arial" w:hAnsi="Arial"/>
-          <w:b/>
-          <w:color w:val="475569"/>
-          <w:sz w:val="26"/>
-        </w:rPr>
-        <w:br/>
-        <w:t>◆ Escena 3: La Trampa de la Seda</w:t>
-        <w:br/>
+        <w:drawing>
+          <wp:inline xmlns:a="http://schemas.openxmlformats.org/drawingml/2006/main" xmlns:pic="http://schemas.openxmlformats.org/drawingml/2006/picture">
+            <wp:extent cx="4754880" cy="2674620"/>
+            <wp:docPr id="6" name="Picture 6"/>
+            <wp:cNvGraphicFramePr>
+              <a:graphicFrameLocks noChangeAspect="1"/>
+            </wp:cNvGraphicFramePr>
+            <a:graphic>
+              <a:graphicData uri="http://schemas.openxmlformats.org/drawingml/2006/picture">
+                <pic:pic>
+                  <pic:nvPicPr>
+                    <pic:cNvPr id="0" name="escena_c2_e2.jpg"/>
+                    <pic:cNvPicPr/>
+                  </pic:nvPicPr>
+                  <pic:blipFill>
+                    <a:blip r:embed="rId14"/>
+                    <a:stretch>
+                      <a:fillRect/>
+                    </a:stretch>
+                  </pic:blipFill>
+                  <pic:spPr>
+                    <a:xfrm>
+                      <a:off x="0" y="0"/>
+                      <a:ext cx="4754880" cy="2674620"/>
+                    </a:xfrm>
+                    <a:prstGeom prst="rect"/>
+                  </pic:spPr>
+                </pic:pic>
+              </a:graphicData>
+            </a:graphic>
+          </wp:inline>
+        </w:drawing>
       </w:r>
     </w:p>
     <w:p>
+      <w:bookmarkStart w:id="21" w:name="cap_2_esc"/>
+      <w:pPr>
+        <w:keepNext/>
+        <w:spacing w:before="240" w:after="120"/>
+        <w:jc w:val="left"/>
+      </w:pPr>
       <w:r>
         <w:rPr>
-          <w:rFonts w:ascii="Georgia" w:hAnsi="Georgia"/>
+          <w:rFonts w:ascii="Calibri" w:hAnsi="Calibri"/>
+          <w:b/>
+          <w:color w:val="4A5568"/>
+          <w:sz w:val="30"/>
+        </w:rPr>
+        <w:t>Escena 3: La Trampa de la Seda</w:t>
+      </w:r>
+      <w:bookmarkEnd w:id="21"/>
+    </w:p>
+    <w:p>
+      <w:pPr>
+        <w:spacing w:line="276" w:lineRule="auto" w:after="160"/>
+      </w:pPr>
+      <w:r>
+        <w:rPr>
+          <w:rFonts w:ascii="Calibri" w:hAnsi="Calibri"/>
           <w:sz w:val="22"/>
         </w:rPr>
         <w:t>La faja obi se dividió en seis cintas independientes que atacaron desde todos los ángulos.</w:t>
@@ -475,54 +666,93 @@
       </w:r>
     </w:p>
     <w:p>
+      <w:pPr>
+        <w:spacing w:before="120" w:after="280"/>
+        <w:jc w:val="center"/>
+      </w:pPr>
+      <w:r>
+        <w:drawing>
+          <wp:inline xmlns:a="http://schemas.openxmlformats.org/drawingml/2006/main" xmlns:pic="http://schemas.openxmlformats.org/drawingml/2006/picture">
+            <wp:extent cx="4754880" cy="2674620"/>
+            <wp:docPr id="7" name="Picture 7"/>
+            <wp:cNvGraphicFramePr>
+              <a:graphicFrameLocks noChangeAspect="1"/>
+            </wp:cNvGraphicFramePr>
+            <a:graphic>
+              <a:graphicData uri="http://schemas.openxmlformats.org/drawingml/2006/picture">
+                <pic:pic>
+                  <pic:nvPicPr>
+                    <pic:cNvPr id="0" name="escena_c2_e3.jpg"/>
+                    <pic:cNvPicPr/>
+                  </pic:nvPicPr>
+                  <pic:blipFill>
+                    <a:blip r:embed="rId15"/>
+                    <a:stretch>
+                      <a:fillRect/>
+                    </a:stretch>
+                  </pic:blipFill>
+                  <pic:spPr>
+                    <a:xfrm>
+                      <a:off x="0" y="0"/>
+                      <a:ext cx="4754880" cy="2674620"/>
+                    </a:xfrm>
+                    <a:prstGeom prst="rect"/>
+                  </pic:spPr>
+                </pic:pic>
+              </a:graphicData>
+            </a:graphic>
+          </wp:inline>
+        </w:drawing>
+      </w:r>
+    </w:p>
+    <w:p>
       <w:r>
         <w:br w:type="page"/>
       </w:r>
     </w:p>
     <w:p>
-      <w:r>
-        <w:bookmarkStart w:id="3" w:name="chap3"/>
-      </w:r>
+      <w:bookmarkStart w:id="30" w:name="cap_3"/>
+      <w:pPr>
+        <w:keepNext/>
+        <w:spacing w:before="240" w:after="120"/>
+        <w:jc w:val="center"/>
+      </w:pPr>
       <w:r>
         <w:rPr>
-          <w:rFonts w:ascii="Arial" w:hAnsi="Arial"/>
+          <w:rFonts w:ascii="Calibri" w:hAnsi="Calibri"/>
           <w:b/>
-          <w:color w:val="B91C1C"/>
-          <w:sz w:val="28"/>
+          <w:color w:val="8B0000"/>
+          <w:sz w:val="40"/>
         </w:rPr>
-        <w:t>Capítulo 3</w:t>
-        <w:br/>
+        <w:t>Capítulo 3: El Doble Lunar</w:t>
       </w:r>
+      <w:bookmarkEnd w:id="30"/>
+    </w:p>
+    <w:p>
+      <w:bookmarkStart w:id="31" w:name="cap_3_esc"/>
+      <w:pPr>
+        <w:keepNext/>
+        <w:spacing w:before="240" w:after="120"/>
+        <w:jc w:val="left"/>
+      </w:pPr>
       <w:r>
         <w:rPr>
-          <w:rFonts w:ascii="Arial" w:hAnsi="Arial"/>
+          <w:rFonts w:ascii="Calibri" w:hAnsi="Calibri"/>
           <w:b/>
-          <w:color w:val="DC2626"/>
-          <w:sz w:val="40"/>
+          <w:color w:val="4A5568"/>
+          <w:sz w:val="30"/>
         </w:rPr>
-        <w:t>El Doble Lunar</w:t>
+        <w:t>Escena 1: La Fuerza de Miyuki</w:t>
       </w:r>
-      <w:r>
-        <w:bookmarkEnd w:id="3"/>
-      </w:r>
+      <w:bookmarkEnd w:id="31"/>
     </w:p>
     <w:p>
+      <w:pPr>
+        <w:spacing w:line="276" w:lineRule="auto" w:after="160"/>
+      </w:pPr>
       <w:r>
         <w:rPr>
-          <w:rFonts w:ascii="Arial" w:hAnsi="Arial"/>
-          <w:b/>
-          <w:color w:val="475569"/>
-          <w:sz w:val="26"/>
-        </w:rPr>
-        <w:br/>
-        <w:t>◆ Escena 1: La Fuerza de Miyuki</w:t>
-        <w:br/>
-      </w:r>
-    </w:p>
-    <w:p>
-      <w:r>
-        <w:rPr>
-          <w:rFonts w:ascii="Georgia" w:hAnsi="Georgia"/>
+          <w:rFonts w:ascii="Calibri" w:hAnsi="Calibri"/>
           <w:sz w:val="22"/>
         </w:rPr>
         <w:t>Miyuki se lanzó directo contra Daki. Con una patada impregnada de llamas púrpuras, destruyó la faja obi principal y arrojó a la matrona demonio a través del techo hacia los tejados del distrito.</w:t>
@@ -544,22 +774,70 @@
       </w:r>
     </w:p>
     <w:p>
+      <w:pPr>
+        <w:spacing w:before="120" w:after="280"/>
+        <w:jc w:val="center"/>
+      </w:pPr>
       <w:r>
-        <w:rPr>
-          <w:rFonts w:ascii="Arial" w:hAnsi="Arial"/>
-          <w:b/>
-          <w:color w:val="475569"/>
-          <w:sz w:val="26"/>
-        </w:rPr>
-        <w:br/>
-        <w:t>◆ Escena 2: El Segundo Hermano</w:t>
-        <w:br/>
+        <w:drawing>
+          <wp:inline xmlns:a="http://schemas.openxmlformats.org/drawingml/2006/main" xmlns:pic="http://schemas.openxmlformats.org/drawingml/2006/picture">
+            <wp:extent cx="4754880" cy="2674620"/>
+            <wp:docPr id="8" name="Picture 8"/>
+            <wp:cNvGraphicFramePr>
+              <a:graphicFrameLocks noChangeAspect="1"/>
+            </wp:cNvGraphicFramePr>
+            <a:graphic>
+              <a:graphicData uri="http://schemas.openxmlformats.org/drawingml/2006/picture">
+                <pic:pic>
+                  <pic:nvPicPr>
+                    <pic:cNvPr id="0" name="escena_c3_e1.jpg"/>
+                    <pic:cNvPicPr/>
+                  </pic:nvPicPr>
+                  <pic:blipFill>
+                    <a:blip r:embed="rId16"/>
+                    <a:stretch>
+                      <a:fillRect/>
+                    </a:stretch>
+                  </pic:blipFill>
+                  <pic:spPr>
+                    <a:xfrm>
+                      <a:off x="0" y="0"/>
+                      <a:ext cx="4754880" cy="2674620"/>
+                    </a:xfrm>
+                    <a:prstGeom prst="rect"/>
+                  </pic:spPr>
+                </pic:pic>
+              </a:graphicData>
+            </a:graphic>
+          </wp:inline>
+        </w:drawing>
       </w:r>
     </w:p>
     <w:p>
+      <w:bookmarkStart w:id="31" w:name="cap_3_esc"/>
+      <w:pPr>
+        <w:keepNext/>
+        <w:spacing w:before="240" w:after="120"/>
+        <w:jc w:val="left"/>
+      </w:pPr>
       <w:r>
         <w:rPr>
-          <w:rFonts w:ascii="Georgia" w:hAnsi="Georgia"/>
+          <w:rFonts w:ascii="Calibri" w:hAnsi="Calibri"/>
+          <w:b/>
+          <w:color w:val="4A5568"/>
+          <w:sz w:val="30"/>
+        </w:rPr>
+        <w:t>Escena 2: El Segundo Hermano</w:t>
+      </w:r>
+      <w:bookmarkEnd w:id="31"/>
+    </w:p>
+    <w:p>
+      <w:pPr>
+        <w:spacing w:line="276" w:lineRule="auto" w:after="160"/>
+      </w:pPr>
+      <w:r>
+        <w:rPr>
+          <w:rFonts w:ascii="Calibri" w:hAnsi="Calibri"/>
           <w:sz w:val="22"/>
         </w:rPr>
         <w:t>Pero la cabeza de Daki no se convirtió en cenizas. Comenzó a llorar ruidosamente como una niña pequeña.</w:t>
@@ -578,22 +856,70 @@
       </w:r>
     </w:p>
     <w:p>
+      <w:pPr>
+        <w:spacing w:before="120" w:after="280"/>
+        <w:jc w:val="center"/>
+      </w:pPr>
       <w:r>
-        <w:rPr>
-          <w:rFonts w:ascii="Arial" w:hAnsi="Arial"/>
-          <w:b/>
-          <w:color w:val="475569"/>
-          <w:sz w:val="26"/>
-        </w:rPr>
-        <w:br/>
-        <w:t>◆ Escena 3: La Regla de las Dos Cabezas</w:t>
-        <w:br/>
+        <w:drawing>
+          <wp:inline xmlns:a="http://schemas.openxmlformats.org/drawingml/2006/main" xmlns:pic="http://schemas.openxmlformats.org/drawingml/2006/picture">
+            <wp:extent cx="4754880" cy="2674620"/>
+            <wp:docPr id="9" name="Picture 9"/>
+            <wp:cNvGraphicFramePr>
+              <a:graphicFrameLocks noChangeAspect="1"/>
+            </wp:cNvGraphicFramePr>
+            <a:graphic>
+              <a:graphicData uri="http://schemas.openxmlformats.org/drawingml/2006/picture">
+                <pic:pic>
+                  <pic:nvPicPr>
+                    <pic:cNvPr id="0" name="escena_c3_e2.jpg"/>
+                    <pic:cNvPicPr/>
+                  </pic:nvPicPr>
+                  <pic:blipFill>
+                    <a:blip r:embed="rId17"/>
+                    <a:stretch>
+                      <a:fillRect/>
+                    </a:stretch>
+                  </pic:blipFill>
+                  <pic:spPr>
+                    <a:xfrm>
+                      <a:off x="0" y="0"/>
+                      <a:ext cx="4754880" cy="2674620"/>
+                    </a:xfrm>
+                    <a:prstGeom prst="rect"/>
+                  </pic:spPr>
+                </pic:pic>
+              </a:graphicData>
+            </a:graphic>
+          </wp:inline>
+        </w:drawing>
       </w:r>
     </w:p>
     <w:p>
+      <w:bookmarkStart w:id="31" w:name="cap_3_esc"/>
+      <w:pPr>
+        <w:keepNext/>
+        <w:spacing w:before="240" w:after="120"/>
+        <w:jc w:val="left"/>
+      </w:pPr>
       <w:r>
         <w:rPr>
-          <w:rFonts w:ascii="Georgia" w:hAnsi="Georgia"/>
+          <w:rFonts w:ascii="Calibri" w:hAnsi="Calibri"/>
+          <w:b/>
+          <w:color w:val="4A5568"/>
+          <w:sz w:val="30"/>
+        </w:rPr>
+        <w:t>Escena 3: La Regla de las Dos Cabezas</w:t>
+      </w:r>
+      <w:bookmarkEnd w:id="31"/>
+    </w:p>
+    <w:p>
+      <w:pPr>
+        <w:spacing w:line="276" w:lineRule="auto" w:after="160"/>
+      </w:pPr>
+      <w:r>
+        <w:rPr>
+          <w:rFonts w:ascii="Calibri" w:hAnsi="Calibri"/>
           <w:sz w:val="22"/>
         </w:rPr>
         <w:t>Kanae y el muchacho del haori amarillo llegaron al tejado para reunirse con Ren.</w:t>
@@ -612,54 +938,93 @@
       </w:r>
     </w:p>
     <w:p>
+      <w:pPr>
+        <w:spacing w:before="120" w:after="280"/>
+        <w:jc w:val="center"/>
+      </w:pPr>
+      <w:r>
+        <w:drawing>
+          <wp:inline xmlns:a="http://schemas.openxmlformats.org/drawingml/2006/main" xmlns:pic="http://schemas.openxmlformats.org/drawingml/2006/picture">
+            <wp:extent cx="4754880" cy="2674620"/>
+            <wp:docPr id="10" name="Picture 10"/>
+            <wp:cNvGraphicFramePr>
+              <a:graphicFrameLocks noChangeAspect="1"/>
+            </wp:cNvGraphicFramePr>
+            <a:graphic>
+              <a:graphicData uri="http://schemas.openxmlformats.org/drawingml/2006/picture">
+                <pic:pic>
+                  <pic:nvPicPr>
+                    <pic:cNvPr id="0" name="escena_c3_e3.jpg"/>
+                    <pic:cNvPicPr/>
+                  </pic:nvPicPr>
+                  <pic:blipFill>
+                    <a:blip r:embed="rId18"/>
+                    <a:stretch>
+                      <a:fillRect/>
+                    </a:stretch>
+                  </pic:blipFill>
+                  <pic:spPr>
+                    <a:xfrm>
+                      <a:off x="0" y="0"/>
+                      <a:ext cx="4754880" cy="2674620"/>
+                    </a:xfrm>
+                    <a:prstGeom prst="rect"/>
+                  </pic:spPr>
+                </pic:pic>
+              </a:graphicData>
+            </a:graphic>
+          </wp:inline>
+        </w:drawing>
+      </w:r>
+    </w:p>
+    <w:p>
       <w:r>
         <w:br w:type="page"/>
       </w:r>
     </w:p>
     <w:p>
-      <w:r>
-        <w:bookmarkStart w:id="4" w:name="chap4"/>
-      </w:r>
+      <w:bookmarkStart w:id="40" w:name="cap_4"/>
+      <w:pPr>
+        <w:keepNext/>
+        <w:spacing w:before="240" w:after="120"/>
+        <w:jc w:val="center"/>
+      </w:pPr>
       <w:r>
         <w:rPr>
-          <w:rFonts w:ascii="Arial" w:hAnsi="Arial"/>
+          <w:rFonts w:ascii="Calibri" w:hAnsi="Calibri"/>
           <w:b/>
-          <w:color w:val="B91C1C"/>
-          <w:sz w:val="28"/>
+          <w:color w:val="8B0000"/>
+          <w:sz w:val="40"/>
         </w:rPr>
-        <w:t>Capítulo 4</w:t>
-        <w:br/>
+        <w:t>Capítulo 4: La Purificación de la Sangre</w:t>
       </w:r>
+      <w:bookmarkEnd w:id="40"/>
+    </w:p>
+    <w:p>
+      <w:bookmarkStart w:id="41" w:name="cap_4_esc"/>
+      <w:pPr>
+        <w:keepNext/>
+        <w:spacing w:before="240" w:after="120"/>
+        <w:jc w:val="left"/>
+      </w:pPr>
       <w:r>
         <w:rPr>
-          <w:rFonts w:ascii="Arial" w:hAnsi="Arial"/>
+          <w:rFonts w:ascii="Calibri" w:hAnsi="Calibri"/>
           <w:b/>
-          <w:color w:val="DC2626"/>
-          <w:sz w:val="40"/>
+          <w:color w:val="4A5568"/>
+          <w:sz w:val="30"/>
         </w:rPr>
-        <w:t>La Purificación de la Sangre</w:t>
+        <w:t>Escena 1: El Veneno Frenado</w:t>
       </w:r>
-      <w:r>
-        <w:bookmarkEnd w:id="4"/>
-      </w:r>
+      <w:bookmarkEnd w:id="41"/>
     </w:p>
     <w:p>
+      <w:pPr>
+        <w:spacing w:line="276" w:lineRule="auto" w:after="160"/>
+      </w:pPr>
       <w:r>
         <w:rPr>
-          <w:rFonts w:ascii="Arial" w:hAnsi="Arial"/>
-          <w:b/>
-          <w:color w:val="475569"/>
-          <w:sz w:val="26"/>
-        </w:rPr>
-        <w:br/>
-        <w:t>◆ Escena 1: El Veneno Frenado</w:t>
-        <w:br/>
-      </w:r>
-    </w:p>
-    <w:p>
-      <w:r>
-        <w:rPr>
-          <w:rFonts w:ascii="Georgia" w:hAnsi="Georgia"/>
+          <w:rFonts w:ascii="Calibri" w:hAnsi="Calibri"/>
           <w:sz w:val="22"/>
         </w:rPr>
         <w:t>Antes de que la hoz de Gyutaro alcanzara el cuello de Ren, Miyuki se interpuso.</w:t>
@@ -681,22 +1046,70 @@
       </w:r>
     </w:p>
     <w:p>
+      <w:pPr>
+        <w:spacing w:before="120" w:after="280"/>
+        <w:jc w:val="center"/>
+      </w:pPr>
       <w:r>
-        <w:rPr>
-          <w:rFonts w:ascii="Arial" w:hAnsi="Arial"/>
-          <w:b/>
-          <w:color w:val="475569"/>
-          <w:sz w:val="26"/>
-        </w:rPr>
-        <w:br/>
-        <w:t>◆ Escena 2: La Danza del Fuego Solar</w:t>
-        <w:br/>
+        <w:drawing>
+          <wp:inline xmlns:a="http://schemas.openxmlformats.org/drawingml/2006/main" xmlns:pic="http://schemas.openxmlformats.org/drawingml/2006/picture">
+            <wp:extent cx="4754880" cy="2674620"/>
+            <wp:docPr id="11" name="Picture 11"/>
+            <wp:cNvGraphicFramePr>
+              <a:graphicFrameLocks noChangeAspect="1"/>
+            </wp:cNvGraphicFramePr>
+            <a:graphic>
+              <a:graphicData uri="http://schemas.openxmlformats.org/drawingml/2006/picture">
+                <pic:pic>
+                  <pic:nvPicPr>
+                    <pic:cNvPr id="0" name="escena_c4_e1.jpg"/>
+                    <pic:cNvPicPr/>
+                  </pic:nvPicPr>
+                  <pic:blipFill>
+                    <a:blip r:embed="rId19"/>
+                    <a:stretch>
+                      <a:fillRect/>
+                    </a:stretch>
+                  </pic:blipFill>
+                  <pic:spPr>
+                    <a:xfrm>
+                      <a:off x="0" y="0"/>
+                      <a:ext cx="4754880" cy="2674620"/>
+                    </a:xfrm>
+                    <a:prstGeom prst="rect"/>
+                  </pic:spPr>
+                </pic:pic>
+              </a:graphicData>
+            </a:graphic>
+          </wp:inline>
+        </w:drawing>
       </w:r>
     </w:p>
     <w:p>
+      <w:bookmarkStart w:id="41" w:name="cap_4_esc"/>
+      <w:pPr>
+        <w:keepNext/>
+        <w:spacing w:before="240" w:after="120"/>
+        <w:jc w:val="left"/>
+      </w:pPr>
       <w:r>
         <w:rPr>
-          <w:rFonts w:ascii="Georgia" w:hAnsi="Georgia"/>
+          <w:rFonts w:ascii="Calibri" w:hAnsi="Calibri"/>
+          <w:b/>
+          <w:color w:val="4A5568"/>
+          <w:sz w:val="30"/>
+        </w:rPr>
+        <w:t>Escena 2: La Danza del Fuego Solar</w:t>
+      </w:r>
+      <w:bookmarkEnd w:id="41"/>
+    </w:p>
+    <w:p>
+      <w:pPr>
+        <w:spacing w:line="276" w:lineRule="auto" w:after="160"/>
+      </w:pPr>
+      <w:r>
+        <w:rPr>
+          <w:rFonts w:ascii="Calibri" w:hAnsi="Calibri"/>
           <w:sz w:val="22"/>
         </w:rPr>
         <w:t>Ren ajustó la postura de sus pies sobre las tejas de madera. Inhaló aire según la secuencia de los Diarios del Sol, coordinando su ritmo cardíaco con los doce movimientos rituales de la herrería.</w:t>
@@ -715,22 +1128,70 @@
       </w:r>
     </w:p>
     <w:p>
+      <w:pPr>
+        <w:spacing w:before="120" w:after="280"/>
+        <w:jc w:val="center"/>
+      </w:pPr>
       <w:r>
-        <w:rPr>
-          <w:rFonts w:ascii="Arial" w:hAnsi="Arial"/>
-          <w:b/>
-          <w:color w:val="475569"/>
-          <w:sz w:val="26"/>
-        </w:rPr>
-        <w:br/>
-        <w:t>◆ Escena 3: La Decapitamiento Simultáneo</w:t>
-        <w:br/>
+        <w:drawing>
+          <wp:inline xmlns:a="http://schemas.openxmlformats.org/drawingml/2006/main" xmlns:pic="http://schemas.openxmlformats.org/drawingml/2006/picture">
+            <wp:extent cx="4754880" cy="2674620"/>
+            <wp:docPr id="12" name="Picture 12"/>
+            <wp:cNvGraphicFramePr>
+              <a:graphicFrameLocks noChangeAspect="1"/>
+            </wp:cNvGraphicFramePr>
+            <a:graphic>
+              <a:graphicData uri="http://schemas.openxmlformats.org/drawingml/2006/picture">
+                <pic:pic>
+                  <pic:nvPicPr>
+                    <pic:cNvPr id="0" name="escena_c4_e2.jpg"/>
+                    <pic:cNvPicPr/>
+                  </pic:nvPicPr>
+                  <pic:blipFill>
+                    <a:blip r:embed="rId20"/>
+                    <a:stretch>
+                      <a:fillRect/>
+                    </a:stretch>
+                  </pic:blipFill>
+                  <pic:spPr>
+                    <a:xfrm>
+                      <a:off x="0" y="0"/>
+                      <a:ext cx="4754880" cy="2674620"/>
+                    </a:xfrm>
+                    <a:prstGeom prst="rect"/>
+                  </pic:spPr>
+                </pic:pic>
+              </a:graphicData>
+            </a:graphic>
+          </wp:inline>
+        </w:drawing>
       </w:r>
     </w:p>
     <w:p>
+      <w:bookmarkStart w:id="41" w:name="cap_4_esc"/>
+      <w:pPr>
+        <w:keepNext/>
+        <w:spacing w:before="240" w:after="120"/>
+        <w:jc w:val="left"/>
+      </w:pPr>
       <w:r>
         <w:rPr>
-          <w:rFonts w:ascii="Georgia" w:hAnsi="Georgia"/>
+          <w:rFonts w:ascii="Calibri" w:hAnsi="Calibri"/>
+          <w:b/>
+          <w:color w:val="4A5568"/>
+          <w:sz w:val="30"/>
+        </w:rPr>
+        <w:t>Escena 3: La Decapitamiento Simultáneo</w:t>
+      </w:r>
+      <w:bookmarkEnd w:id="41"/>
+    </w:p>
+    <w:p>
+      <w:pPr>
+        <w:spacing w:line="276" w:lineRule="auto" w:after="160"/>
+      </w:pPr>
+      <w:r>
+        <w:rPr>
+          <w:rFonts w:ascii="Calibri" w:hAnsi="Calibri"/>
           <w:sz w:val="22"/>
         </w:rPr>
         <w:t>Las dos katanas alcanzaron sus objetivos al mismo milisegundo.</w:t>
@@ -749,54 +1210,93 @@
       </w:r>
     </w:p>
     <w:p>
+      <w:pPr>
+        <w:spacing w:before="120" w:after="280"/>
+        <w:jc w:val="center"/>
+      </w:pPr>
+      <w:r>
+        <w:drawing>
+          <wp:inline xmlns:a="http://schemas.openxmlformats.org/drawingml/2006/main" xmlns:pic="http://schemas.openxmlformats.org/drawingml/2006/picture">
+            <wp:extent cx="4754880" cy="2674620"/>
+            <wp:docPr id="13" name="Picture 13"/>
+            <wp:cNvGraphicFramePr>
+              <a:graphicFrameLocks noChangeAspect="1"/>
+            </wp:cNvGraphicFramePr>
+            <a:graphic>
+              <a:graphicData uri="http://schemas.openxmlformats.org/drawingml/2006/picture">
+                <pic:pic>
+                  <pic:nvPicPr>
+                    <pic:cNvPr id="0" name="escena_c4_e3.jpg"/>
+                    <pic:cNvPicPr/>
+                  </pic:nvPicPr>
+                  <pic:blipFill>
+                    <a:blip r:embed="rId21"/>
+                    <a:stretch>
+                      <a:fillRect/>
+                    </a:stretch>
+                  </pic:blipFill>
+                  <pic:spPr>
+                    <a:xfrm>
+                      <a:off x="0" y="0"/>
+                      <a:ext cx="4754880" cy="2674620"/>
+                    </a:xfrm>
+                    <a:prstGeom prst="rect"/>
+                  </pic:spPr>
+                </pic:pic>
+              </a:graphicData>
+            </a:graphic>
+          </wp:inline>
+        </w:drawing>
+      </w:r>
+    </w:p>
+    <w:p>
       <w:r>
         <w:br w:type="page"/>
       </w:r>
     </w:p>
     <w:p>
-      <w:r>
-        <w:bookmarkStart w:id="5" w:name="chap5"/>
-      </w:r>
+      <w:bookmarkStart w:id="50" w:name="cap_5"/>
+      <w:pPr>
+        <w:keepNext/>
+        <w:spacing w:before="240" w:after="120"/>
+        <w:jc w:val="center"/>
+      </w:pPr>
       <w:r>
         <w:rPr>
-          <w:rFonts w:ascii="Arial" w:hAnsi="Arial"/>
+          <w:rFonts w:ascii="Calibri" w:hAnsi="Calibri"/>
           <w:b/>
-          <w:color w:val="B91C1C"/>
-          <w:sz w:val="28"/>
+          <w:color w:val="8B0000"/>
+          <w:sz w:val="40"/>
         </w:rPr>
-        <w:t>Capítulo 5</w:t>
-        <w:br/>
+        <w:t>Capítulo 5: Las Cenizas de la Misericordia (Clímax del Volumen 4)</w:t>
       </w:r>
+      <w:bookmarkEnd w:id="50"/>
+    </w:p>
+    <w:p>
+      <w:bookmarkStart w:id="51" w:name="cap_5_esc"/>
+      <w:pPr>
+        <w:keepNext/>
+        <w:spacing w:before="240" w:after="120"/>
+        <w:jc w:val="left"/>
+      </w:pPr>
       <w:r>
         <w:rPr>
-          <w:rFonts w:ascii="Arial" w:hAnsi="Arial"/>
+          <w:rFonts w:ascii="Calibri" w:hAnsi="Calibri"/>
           <w:b/>
-          <w:color w:val="DC2626"/>
-          <w:sz w:val="40"/>
+          <w:color w:val="4A5568"/>
+          <w:sz w:val="30"/>
         </w:rPr>
-        <w:t>Las Cenizas de la Misericordia (Clímax del Volumen 4)</w:t>
+        <w:t>Escena 1: Las Almas del Pasado</w:t>
       </w:r>
-      <w:r>
-        <w:bookmarkEnd w:id="5"/>
-      </w:r>
+      <w:bookmarkEnd w:id="51"/>
     </w:p>
     <w:p>
+      <w:pPr>
+        <w:spacing w:line="276" w:lineRule="auto" w:after="160"/>
+      </w:pPr>
       <w:r>
         <w:rPr>
-          <w:rFonts w:ascii="Arial" w:hAnsi="Arial"/>
-          <w:b/>
-          <w:color w:val="475569"/>
-          <w:sz w:val="26"/>
-        </w:rPr>
-        <w:br/>
-        <w:t>◆ Escena 1: Las Almas del Pasado</w:t>
-        <w:br/>
-      </w:r>
-    </w:p>
-    <w:p>
-      <w:r>
-        <w:rPr>
-          <w:rFonts w:ascii="Georgia" w:hAnsi="Georgia"/>
+          <w:rFonts w:ascii="Calibri" w:hAnsi="Calibri"/>
           <w:sz w:val="22"/>
         </w:rPr>
         <w:t>Antes de que las cabezas de Gyutaro y Daki se convirtieran en polvo, sus espíritus permanecieron flotando en la penumbra de la calle abandonada.</w:t>
@@ -818,22 +1318,70 @@
       </w:r>
     </w:p>
     <w:p>
+      <w:pPr>
+        <w:spacing w:before="120" w:after="280"/>
+        <w:jc w:val="center"/>
+      </w:pPr>
       <w:r>
-        <w:rPr>
-          <w:rFonts w:ascii="Arial" w:hAnsi="Arial"/>
-          <w:b/>
-          <w:color w:val="475569"/>
-          <w:sz w:val="26"/>
-        </w:rPr>
-        <w:br/>
-        <w:t>◆ Escena 2: El Abrazo en el Fuego</w:t>
-        <w:br/>
+        <w:drawing>
+          <wp:inline xmlns:a="http://schemas.openxmlformats.org/drawingml/2006/main" xmlns:pic="http://schemas.openxmlformats.org/drawingml/2006/picture">
+            <wp:extent cx="4754880" cy="2674620"/>
+            <wp:docPr id="14" name="Picture 14"/>
+            <wp:cNvGraphicFramePr>
+              <a:graphicFrameLocks noChangeAspect="1"/>
+            </wp:cNvGraphicFramePr>
+            <a:graphic>
+              <a:graphicData uri="http://schemas.openxmlformats.org/drawingml/2006/picture">
+                <pic:pic>
+                  <pic:nvPicPr>
+                    <pic:cNvPr id="0" name="escena_c5_e1.jpg"/>
+                    <pic:cNvPicPr/>
+                  </pic:nvPicPr>
+                  <pic:blipFill>
+                    <a:blip r:embed="rId22"/>
+                    <a:stretch>
+                      <a:fillRect/>
+                    </a:stretch>
+                  </pic:blipFill>
+                  <pic:spPr>
+                    <a:xfrm>
+                      <a:off x="0" y="0"/>
+                      <a:ext cx="4754880" cy="2674620"/>
+                    </a:xfrm>
+                    <a:prstGeom prst="rect"/>
+                  </pic:spPr>
+                </pic:pic>
+              </a:graphicData>
+            </a:graphic>
+          </wp:inline>
+        </w:drawing>
       </w:r>
     </w:p>
     <w:p>
+      <w:bookmarkStart w:id="51" w:name="cap_5_esc"/>
+      <w:pPr>
+        <w:keepNext/>
+        <w:spacing w:before="240" w:after="120"/>
+        <w:jc w:val="left"/>
+      </w:pPr>
       <w:r>
         <w:rPr>
-          <w:rFonts w:ascii="Georgia" w:hAnsi="Georgia"/>
+          <w:rFonts w:ascii="Calibri" w:hAnsi="Calibri"/>
+          <w:b/>
+          <w:color w:val="4A5568"/>
+          <w:sz w:val="30"/>
+        </w:rPr>
+        <w:t>Escena 2: El Abrazo en el Fuego</w:t>
+      </w:r>
+      <w:bookmarkEnd w:id="51"/>
+    </w:p>
+    <w:p>
+      <w:pPr>
+        <w:spacing w:line="276" w:lineRule="auto" w:after="160"/>
+      </w:pPr>
+      <w:r>
+        <w:rPr>
+          <w:rFonts w:ascii="Calibri" w:hAnsi="Calibri"/>
           <w:sz w:val="22"/>
         </w:rPr>
         <w:t>—No mientas —dijo Ren con amabilidad—. Los hermanos no se odian. Sé lo que es querer proteger a tu hermana a cualquier costo. Ella te ama, solo tiene miedo.</w:t>
@@ -852,22 +1400,70 @@
       </w:r>
     </w:p>
     <w:p>
+      <w:pPr>
+        <w:spacing w:before="120" w:after="280"/>
+        <w:jc w:val="center"/>
+      </w:pPr>
       <w:r>
-        <w:rPr>
-          <w:rFonts w:ascii="Arial" w:hAnsi="Arial"/>
-          <w:b/>
-          <w:color w:val="475569"/>
-          <w:sz w:val="26"/>
-        </w:rPr>
-        <w:br/>
-        <w:t>◆ Escena 3: La Ira de Muzan (Cierre del Tomo 4)</w:t>
-        <w:br/>
+        <w:drawing>
+          <wp:inline xmlns:a="http://schemas.openxmlformats.org/drawingml/2006/main" xmlns:pic="http://schemas.openxmlformats.org/drawingml/2006/picture">
+            <wp:extent cx="4754880" cy="2674620"/>
+            <wp:docPr id="15" name="Picture 15"/>
+            <wp:cNvGraphicFramePr>
+              <a:graphicFrameLocks noChangeAspect="1"/>
+            </wp:cNvGraphicFramePr>
+            <a:graphic>
+              <a:graphicData uri="http://schemas.openxmlformats.org/drawingml/2006/picture">
+                <pic:pic>
+                  <pic:nvPicPr>
+                    <pic:cNvPr id="0" name="escena_c5_e2.jpg"/>
+                    <pic:cNvPicPr/>
+                  </pic:nvPicPr>
+                  <pic:blipFill>
+                    <a:blip r:embed="rId23"/>
+                    <a:stretch>
+                      <a:fillRect/>
+                    </a:stretch>
+                  </pic:blipFill>
+                  <pic:spPr>
+                    <a:xfrm>
+                      <a:off x="0" y="0"/>
+                      <a:ext cx="4754880" cy="2674620"/>
+                    </a:xfrm>
+                    <a:prstGeom prst="rect"/>
+                  </pic:spPr>
+                </pic:pic>
+              </a:graphicData>
+            </a:graphic>
+          </wp:inline>
+        </w:drawing>
       </w:r>
     </w:p>
     <w:p>
+      <w:bookmarkStart w:id="51" w:name="cap_5_esc"/>
+      <w:pPr>
+        <w:keepNext/>
+        <w:spacing w:before="240" w:after="120"/>
+        <w:jc w:val="left"/>
+      </w:pPr>
       <w:r>
         <w:rPr>
-          <w:rFonts w:ascii="Georgia" w:hAnsi="Georgia"/>
+          <w:rFonts w:ascii="Calibri" w:hAnsi="Calibri"/>
+          <w:b/>
+          <w:color w:val="4A5568"/>
+          <w:sz w:val="30"/>
+        </w:rPr>
+        <w:t>Escena 3: La Ira de Muzan (Cierre del Tomo 4)</w:t>
+      </w:r>
+      <w:bookmarkEnd w:id="51"/>
+    </w:p>
+    <w:p>
+      <w:pPr>
+        <w:spacing w:line="276" w:lineRule="auto" w:after="160"/>
+      </w:pPr>
+      <w:r>
+        <w:rPr>
+          <w:rFonts w:ascii="Calibri" w:hAnsi="Calibri"/>
           <w:sz w:val="22"/>
         </w:rPr>
         <w:t>En las profundidades del Castillo Infinito —un palacio flotante fuera de la dimensión humana—, la noticia de la caída del Quinto Lunar Rojo sacudió la corte demoníaca.</w:t>
@@ -887,15 +1483,14 @@
     </w:p>
     <w:p>
       <w:pPr>
+        <w:spacing w:before="120" w:after="280"/>
         <w:jc w:val="center"/>
       </w:pPr>
-    </w:p>
-    <w:p>
       <w:r>
         <w:drawing>
           <wp:inline xmlns:a="http://schemas.openxmlformats.org/drawingml/2006/main" xmlns:pic="http://schemas.openxmlformats.org/drawingml/2006/picture">
-            <wp:extent cx="4572000" cy="2551814"/>
-            <wp:docPr id="3" name="Picture 3"/>
+            <wp:extent cx="4754880" cy="2674620"/>
+            <wp:docPr id="16" name="Picture 16"/>
             <wp:cNvGraphicFramePr>
               <a:graphicFrameLocks noChangeAspect="1"/>
             </wp:cNvGraphicFramePr>
@@ -903,11 +1498,11 @@
               <a:graphicData uri="http://schemas.openxmlformats.org/drawingml/2006/picture">
                 <pic:pic>
                   <pic:nvPicPr>
-                    <pic:cNvPr id="0" name="portada.jpg"/>
+                    <pic:cNvPr id="0" name="escena_c5_e3.jpg"/>
                     <pic:cNvPicPr/>
                   </pic:nvPicPr>
                   <pic:blipFill>
-                    <a:blip r:embed="rId9"/>
+                    <a:blip r:embed="rId24"/>
                     <a:stretch>
                       <a:fillRect/>
                     </a:stretch>
@@ -915,7 +1510,7 @@
                   <pic:spPr>
                     <a:xfrm>
                       <a:off x="0" y="0"/>
-                      <a:ext cx="4572000" cy="2551814"/>
+                      <a:ext cx="4754880" cy="2674620"/>
                     </a:xfrm>
                     <a:prstGeom prst="rect"/>
                   </pic:spPr>

</xml_diff>